<commit_message>
Improve guide quality and refresh prototype collateral
</commit_message>
<xml_diff>
--- a/docs/prototype-collateral/KCXDocumentor - Demo Script and Storyboard.docx
+++ b/docs/prototype-collateral/KCXDocumentor - Demo Script and Storyboard.docx
@@ -108,7 +108,7 @@
                 <w:color w:val="1F2937"/>
                 <w:sz w:val="20"/>
               </w:rPr>
-              <w:t>Built as a keycentrix internal artifact using the DamienDev document recipe structure: control metadata, version history, purpose, scope, audience, governance, process detail, and appendices.</w:t>
+              <w:t>Built as a keycentrix internal artifact using the KCX document standard: control metadata, version history, purpose, scope, audience, governance, process detail, and appendices.</w:t>
             </w:r>
           </w:p>
         </w:tc>
@@ -604,7 +604,7 @@
                 <w:color w:val="1F2937"/>
                 <w:sz w:val="19"/>
               </w:rPr>
-              <w:t>DamienDev document recipe</w:t>
+              <w:t>KCX document standard</w:t>
             </w:r>
           </w:p>
         </w:tc>
@@ -1186,7 +1186,7 @@
                 <w:color w:val="1F2937"/>
                 <w:sz w:val="19"/>
               </w:rPr>
-              <w:t>Initial collateral package aligned to the DamienDev document recipe.</w:t>
+              <w:t>Initial collateral package aligned to the KCX document standard.</w:t>
             </w:r>
           </w:p>
         </w:tc>
@@ -1395,6 +1395,14 @@
       </w:pPr>
       <w:r>
         <w:t>Show frame approval and rejection because it is the primary quality gate.</w:t>
+      </w:r>
+    </w:p>
+    <w:p>
+      <w:pPr>
+        <w:pStyle w:val="ListBullet"/>
+      </w:pPr>
+      <w:r>
+        <w:t>Show Add from Video and explain that manually added frames run local OCR and map to the selected segment.</w:t>
       </w:r>
     </w:p>
     <w:p>
@@ -1863,7 +1871,97 @@
                 <w:color w:val="1F2937"/>
                 <w:sz w:val="19"/>
               </w:rPr>
-              <w:t>The reviewer rejects overlays and captures better screenshots when needed.</w:t>
+              <w:t>Recommended, Alternates, and Needs Attention frames make screenshot review explicit.</w:t>
+            </w:r>
+          </w:p>
+        </w:tc>
+      </w:tr>
+      <w:tr>
+        <w:tc>
+          <w:tcPr>
+            <w:tcW w:type="dxa" w:w="3360"/>
+            <w:vAlign w:val="center"/>
+            <w:shd w:fill="F3F4F6"/>
+            <w:tcMar>
+              <w:top w:w="80" w:type="dxa"/>
+              <w:start w:w="120" w:type="dxa"/>
+              <w:bottom w:w="80" w:type="dxa"/>
+              <w:end w:w="120" w:type="dxa"/>
+            </w:tcMar>
+            <w:tcBorders>
+              <w:top w:val="single" w:sz="4" w:color="D7DDE0"/>
+              <w:left w:val="single" w:sz="4" w:color="D7DDE0"/>
+              <w:bottom w:val="single" w:sz="4" w:color="D7DDE0"/>
+              <w:right w:val="single" w:sz="4" w:color="D7DDE0"/>
+            </w:tcBorders>
+          </w:tcPr>
+          <w:p>
+            <w:r>
+              <w:rPr>
+                <w:rFonts w:ascii="Calibri" w:hAnsi="Calibri"/>
+                <w:b/>
+                <w:color w:val="1F2937"/>
+                <w:sz w:val="19"/>
+              </w:rPr>
+              <w:t>Add Frame</w:t>
+            </w:r>
+          </w:p>
+        </w:tc>
+        <w:tc>
+          <w:tcPr>
+            <w:tcW w:type="dxa" w:w="3360"/>
+            <w:vAlign w:val="center"/>
+            <w:shd w:fill="FFFFFF"/>
+            <w:tcMar>
+              <w:top w:w="80" w:type="dxa"/>
+              <w:start w:w="120" w:type="dxa"/>
+              <w:bottom w:w="80" w:type="dxa"/>
+              <w:end w:w="120" w:type="dxa"/>
+            </w:tcMar>
+            <w:tcBorders>
+              <w:top w:val="single" w:sz="4" w:color="D7DDE0"/>
+              <w:left w:val="single" w:sz="4" w:color="D7DDE0"/>
+              <w:bottom w:val="single" w:sz="4" w:color="D7DDE0"/>
+              <w:right w:val="single" w:sz="4" w:color="D7DDE0"/>
+            </w:tcBorders>
+          </w:tcPr>
+          <w:p>
+            <w:r>
+              <w:rPr>
+                <w:rFonts w:ascii="Calibri" w:hAnsi="Calibri"/>
+                <w:color w:val="1F2937"/>
+                <w:sz w:val="19"/>
+              </w:rPr>
+              <w:t>Video picker</w:t>
+            </w:r>
+          </w:p>
+        </w:tc>
+        <w:tc>
+          <w:tcPr>
+            <w:tcW w:type="dxa" w:w="3360"/>
+            <w:vAlign w:val="center"/>
+            <w:shd w:fill="FFFFFF"/>
+            <w:tcMar>
+              <w:top w:w="80" w:type="dxa"/>
+              <w:start w:w="120" w:type="dxa"/>
+              <w:bottom w:w="80" w:type="dxa"/>
+              <w:end w:w="120" w:type="dxa"/>
+            </w:tcMar>
+            <w:tcBorders>
+              <w:top w:val="single" w:sz="4" w:color="D7DDE0"/>
+              <w:left w:val="single" w:sz="4" w:color="D7DDE0"/>
+              <w:bottom w:val="single" w:sz="4" w:color="D7DDE0"/>
+              <w:right w:val="single" w:sz="4" w:color="D7DDE0"/>
+            </w:tcBorders>
+          </w:tcPr>
+          <w:p>
+            <w:r>
+              <w:rPr>
+                <w:rFonts w:ascii="Calibri" w:hAnsi="Calibri"/>
+                <w:color w:val="1F2937"/>
+                <w:sz w:val="19"/>
+              </w:rPr>
+              <w:t>The reviewer captures a missing screenshot; OCR and segment context are added locally.</w:t>
             </w:r>
           </w:p>
         </w:tc>

</xml_diff>